<commit_message>
Relatório: capítulos 2 e 2.1 resumidos
Co-Authored-By: Claude Opus 5.5 <noreply@anthropic.com>
Claude-Session: https://claude.ai/code/session_01XadjqrPp7Su5vXNMVS9NYz
</commit_message>
<xml_diff>
--- a/docs/relatorio/relatorio.docx
+++ b/docs/relatorio/relatorio.docx
@@ -246,7 +246,7 @@
         </w:rPr>
         <w:t>Figura 1 - Arquitetura da bancada simulada</w:t>
         <w:tab/>
-        <w:t>5</w:t>
+        <w:t>4</w:t>
       </w:r>
     </w:p>
     <w:p>
@@ -264,7 +264,7 @@
         </w:rPr>
         <w:t>Figura 2 - Fluxograma da tarefa de controle (ECU)</w:t>
         <w:tab/>
-        <w:t>6</w:t>
+        <w:t>5</w:t>
       </w:r>
     </w:p>
     <w:p>
@@ -282,7 +282,7 @@
         </w:rPr>
         <w:t>Figura 3 - Fluxograma da planta simulada</w:t>
         <w:tab/>
-        <w:t>6</w:t>
+        <w:t>5</w:t>
       </w:r>
     </w:p>
     <w:p>
@@ -300,7 +300,7 @@
         </w:rPr>
         <w:t>Figura 4 - Painel do operador</w:t>
         <w:tab/>
-        <w:t>10</w:t>
+        <w:t>9</w:t>
       </w:r>
     </w:p>
     <w:p>
@@ -318,7 +318,7 @@
         </w:rPr>
         <w:t>Figura 5 - Resposta a uma redução de 20 % na vazão do bico (2000 rpm, malha fechada)</w:t>
         <w:tab/>
-        <w:t>11</w:t>
+        <w:t>10</w:t>
       </w:r>
     </w:p>
     <w:p>
@@ -372,7 +372,7 @@
         </w:rPr>
         <w:t>Tabela 2 - Janelas de tempo e metas por etapa</w:t>
         <w:tab/>
-        <w:t>7</w:t>
+        <w:t>6</w:t>
       </w:r>
     </w:p>
     <w:p>
@@ -390,7 +390,7 @@
         </w:rPr>
         <w:t>Tabela 3 - Metas de tempo real e valores medidos</w:t>
         <w:tab/>
-        <w:t>8</w:t>
+        <w:t>7</w:t>
       </w:r>
     </w:p>
     <w:p>
@@ -408,7 +408,7 @@
         </w:rPr>
         <w:t>Tabela 4 - Tarefas, interrupções e mecanismos de sincronização</w:t>
         <w:tab/>
-        <w:t>8</w:t>
+        <w:t>7</w:t>
       </w:r>
     </w:p>
     <w:p>
@@ -552,7 +552,7 @@
         </w:rPr>
         <w:t>2.1 RESUMO DE IMPLEMENTAÇÃO DE UM RTOS: FREERTOS</w:t>
         <w:tab/>
-        <w:t>3</w:t>
+        <w:t>2</w:t>
       </w:r>
     </w:p>
     <w:p>
@@ -588,7 +588,7 @@
         </w:rPr>
         <w:t>3.1 CÁLCULOS DE TEMPOS E GARANTIAS DE ATUAÇÃO</w:t>
         <w:tab/>
-        <w:t>6</w:t>
+        <w:t>5</w:t>
       </w:r>
     </w:p>
     <w:p>
@@ -606,7 +606,7 @@
         </w:rPr>
         <w:t>4 DESENVOLVIMENTO</w:t>
         <w:tab/>
-        <w:t>8</w:t>
+        <w:t>7</w:t>
       </w:r>
     </w:p>
     <w:p>
@@ -624,7 +624,7 @@
         </w:rPr>
         <w:t>4.1 TAREFAS E RECURSOS DO FREERTOS</w:t>
         <w:tab/>
-        <w:t>8</w:t>
+        <w:t>7</w:t>
       </w:r>
     </w:p>
     <w:p>
@@ -642,7 +642,7 @@
         </w:rPr>
         <w:t>4.2 TRECHOS DO CÓDIGO-FONTE</w:t>
         <w:tab/>
-        <w:t>9</w:t>
+        <w:t>8</w:t>
       </w:r>
     </w:p>
     <w:p>
@@ -660,7 +660,7 @@
         </w:rPr>
         <w:t>4.3 INTERFACE, TESTES E PRIMEIROS RESULTADOS</w:t>
         <w:tab/>
-        <w:t>10</w:t>
+        <w:t>9</w:t>
       </w:r>
     </w:p>
     <w:p>
@@ -678,7 +678,7 @@
         </w:rPr>
         <w:t>5 CONSIDERAÇÕES FINAIS</w:t>
         <w:tab/>
-        <w:t>11</w:t>
+        <w:t>10</w:t>
       </w:r>
     </w:p>
     <w:p>
@@ -696,7 +696,7 @@
         </w:rPr>
         <w:t>REFERÊNCIAS</w:t>
         <w:tab/>
-        <w:t>12</w:t>
+        <w:t>11</w:t>
       </w:r>
     </w:p>
     <w:p>
@@ -1238,7 +1238,7 @@
         <w:jc w:val="both"/>
       </w:pPr>
       <w:r>
-        <w:t>Um sistema operacional (SO) é a camada de software situada entre o hardware e as aplicações. Ele cumpre dois papéis: oferecer abstrações mais simples que o hardware (arquivos, processos, dispositivos) e gerenciar os recursos do computador, como processador, memória, tempo e dispositivos de entrada e saída, entre programas que competem por eles (TANENBAUM; BOS, 2016).</w:t>
+        <w:t>Um sistema operacional (SO) é a camada de software que gerencia os recursos do hardware (processador, memória, tempo e periféricos) e os oferece às aplicações por abstrações como processos e threads. O acesso aos dispositivos é feito por drivers; em microcontroladores, esse papel cabe a bibliotecas como a HAL do fabricante. Tarefas concorrentes trocam dados por filas e se sincronizam por semáforos e mutexes (TANENBAUM; BOS, 2016).</w:t>
       </w:r>
     </w:p>
     <w:p>
@@ -1247,25 +1247,7 @@
         <w:jc w:val="both"/>
       </w:pPr>
       <w:r>
-        <w:t>A unidade de execução gerenciada pelo SO é o processo, isto é, um programa em execução com seu próprio espaço de endereçamento, registradores e estado. Um processo pode conter várias threads, que compartilham a memória e são escalonadas de forma independente. O escalonador decide qual tarefa ocupa o processador, alternando-as entre os estados pronto, executando e bloqueado. Como tarefas concorrentes acessam dados comuns, o SO fornece mecanismos de sincronização e comunicação, como semáforos, mutexes e filas de mensagens, que protegem as seções críticas e evitam condições de corrida.</w:t>
-      </w:r>
-    </w:p>
-    <w:p>
-      <w:pPr>
-        <w:spacing w:before="0" w:after="160" w:line="360" w:lineRule="auto"/>
-        <w:jc w:val="both"/>
-      </w:pPr>
-      <w:r>
-        <w:t>O acesso aos dispositivos é feito por drivers, módulos que encapsulam os registradores e as interrupções de cada periférico e expõem uma interface uniforme ao restante do sistema. Em microcontroladores, esse papel costuma ser desempenhado por bibliotecas do fabricante, como a HAL (Hardware Abstraction Layer) da STMicroelectronics usada neste projeto.</w:t>
-      </w:r>
-    </w:p>
-    <w:p>
-      <w:pPr>
-        <w:spacing w:before="0" w:after="160" w:line="360" w:lineRule="auto"/>
-        <w:jc w:val="both"/>
-      </w:pPr>
-      <w:r>
-        <w:t>Um sistema operacional de tempo real (RTOS) é aquele em que a correção depende não só do resultado, mas também do instante em que ele é produzido (KOPETZ, 2011). Os prazos podem ser rígidos (hard), quando perdê-los causa falha; firmes (firm), quando o resultado atrasado perde o valor; ou flexíveis (soft), quando apenas degradam o desempenho. Por isso, um RTOS privilegia o determinismo em vez da vazão média: escalonamento preemptivo por prioridade fixa, latência de interrupção limitada, serviços de tempo de execução previsível e pequeno consumo de memória. A análise clássica de escalonabilidade de Liu e Layland (1973) mostra que n tarefas periódicas com prioridades atribuídas pela taxa (menor período, maior prioridade) cumprem seus prazos se a utilização total do processador não exceder n(2</w:t>
+        <w:t>Em um sistema operacional de tempo real (RTOS), a resposta só é correta se produzida dentro do prazo (KOPETZ, 2011). Por isso, o RTOS privilegia o determinismo: escalonamento preemptivo por prioridade fixa, latência de interrupção limitada e serviços de duração previsível. Pelo critério de Liu e Layland (1973), n tarefas periódicas com prioridade pela taxa cumprem seus prazos se a utilização do processador não exceder n(2</w:t>
       </w:r>
       <w:r>
         <w:rPr>
@@ -1293,16 +1275,7 @@
         <w:jc w:val="both"/>
       </w:pPr>
       <w:r>
-        <w:t>O FreeRTOS é um núcleo de tempo real de código aberto (licença MIT), portado para mais de quarenta arquiteturas e com poucos kilobytes de código (BARRY, 2016). A aplicação é dividida em tarefas, cada uma com pilha e prioridade próprias, nos estados executando, pronta, bloqueada ou suspensa. O escalonador é preemptivo: a tarefa pronta de maior prioridade sempre executa, e tarefas de mesma prioridade revezam a cada tick. O tick é uma interrupção periódica que serve de base para atrasos e temporizações, como a função vTaskDelayUntil, que mantém um período fixo sem acumular erro.</w:t>
-      </w:r>
-    </w:p>
-    <w:p>
-      <w:pPr>
-        <w:spacing w:before="0" w:after="160" w:line="360" w:lineRule="auto"/>
-        <w:jc w:val="both"/>
-      </w:pPr>
-      <w:r>
-        <w:t>Para comunicação e sincronização, o FreeRTOS oferece filas (cópia de dados por valor, seguras entre tarefas e interrupções), semáforos binários e contadores, mutexes com herança de prioridade e notificações diretas de tarefa, uma alternativa mais leve ao semáforo que não exige objeto adicional. Rotinas de interrupção usam as variantes FromISR das funções e solicitam troca de contexto com portYIELD_FROM_ISR. Trechos curtos que não podem ser interrompidos são protegidos por taskENTER_CRITICAL e taskEXIT_CRITICAL. Neste projeto, o núcleo roda no Cortex-M0 a 48 MHz, com preempção habilitada, tick de 1 kHz, cinco níveis de prioridade e alocador heap_4 com 7 KB.</w:t>
+        <w:t>O FreeRTOS é um núcleo de tempo real de código aberto e poucos kilobytes (BARRY, 2016). A aplicação é dividida em tarefas com pilha e prioridade próprias, e o escalonador sempre executa a tarefa pronta de maior prioridade. O núcleo oferece filas, semáforos, mutexes e notificações de tarefa, com variantes FromISR para uso em interrupções. Neste projeto, roda no Cortex-M0 a 48 MHz, com tick de 1 kHz e alocador heap_4.</w:t>
       </w:r>
     </w:p>
     <w:p>

</xml_diff>